<commit_message>
subir fase 1, 2, 3 completas, programar slug y visores fase 3 con link externo
</commit_message>
<xml_diff>
--- a/public/docs/fase1/ACTA_DE_CONSTITUCION_AJUPTEL.docx
+++ b/public/docs/fase1/ACTA_DE_CONSTITUCION_AJUPTEL.docx
@@ -449,8 +449,8 @@
         <w:spacing w:lineRule="auto" w:line="240" w:before="0" w:after="0"/>
         <w:jc w:val="center"/>
         <w:rPr>
-          <w:sz w:val="24"/>
-          <w:szCs w:val="24"/>
+          <w:sz w:val="22"/>
+          <w:szCs w:val="22"/>
         </w:rPr>
       </w:pPr>
       <w:r>
@@ -458,8 +458,8 @@
           <w:rFonts w:cs="Arial" w:ascii="Arial" w:hAnsi="Arial"/>
           <w:b/>
           <w:bCs/>
-          <w:sz w:val="24"/>
-          <w:szCs w:val="24"/>
+          <w:sz w:val="22"/>
+          <w:szCs w:val="22"/>
         </w:rPr>
         <w:t xml:space="preserve">ACTA DE CONSTITUCIÓN </w:t>
       </w:r>
@@ -469,8 +469,8 @@
           <w:rFonts w:cs="Arial" w:ascii="Arial" w:hAnsi="Arial"/>
           <w:b/>
           <w:bCs/>
-          <w:sz w:val="24"/>
-          <w:szCs w:val="24"/>
+          <w:sz w:val="22"/>
+          <w:szCs w:val="22"/>
         </w:rPr>
         <w:t>DEL</w:t>
       </w:r>
@@ -480,25 +480,10 @@
           <w:rFonts w:cs="Arial" w:ascii="Arial" w:hAnsi="Arial"/>
           <w:b/>
           <w:bCs/>
-          <w:sz w:val="24"/>
-          <w:szCs w:val="24"/>
+          <w:sz w:val="22"/>
+          <w:szCs w:val="22"/>
         </w:rPr>
         <w:t xml:space="preserve"> </w:t>
-      </w:r>
-      <w:r>
-        <w:rPr>
-          <w:rFonts w:ascii="Arial" w:hAnsi="Arial"/>
-          <w:b/>
-          <w:bCs/>
-          <w:i w:val="false"/>
-          <w:caps w:val="false"/>
-          <w:smallCaps w:val="false"/>
-          <w:color w:val="auto"/>
-          <w:spacing w:val="0"/>
-          <w:sz w:val="24"/>
-          <w:szCs w:val="24"/>
-        </w:rPr>
-        <w:t xml:space="preserve">SISTEMA DE INFORMACIÓN WEB RESPONSIVO CON INTEGRACIÓN DE PORTAL INFORMATIVO Y CHATBOT INTERACTIVO CON INTELIGENCIA ARTIFICIAL ORIENTADO A LA OPTIMIZACIÓN DE LA GESTIÓN DE DATOS DE LA ASOCIACIÓN CIVIL </w:t>
       </w:r>
       <w:r>
         <w:rPr>
@@ -513,22 +498,7 @@
           <w:sz w:val="22"/>
           <w:szCs w:val="22"/>
         </w:rPr>
-        <w:t xml:space="preserve">DE TRABAJADORES DE TELECOMUNICACIONES JUBILADOS Y PENSIONADOS DE CARABOBO </w:t>
-      </w:r>
-      <w:r>
-        <w:rPr>
-          <w:rFonts w:ascii="Arial" w:hAnsi="Arial"/>
-          <w:b/>
-          <w:bCs/>
-          <w:i w:val="false"/>
-          <w:caps w:val="false"/>
-          <w:smallCaps w:val="false"/>
-          <w:color w:val="auto"/>
-          <w:spacing w:val="0"/>
-          <w:sz w:val="24"/>
-          <w:szCs w:val="24"/>
-        </w:rPr>
-        <w:t>(AJUPTEL), REGIÓN CARABOBO</w:t>
+        <w:t>SISTEMA DE INFORMACIÓN WEB RESPONSIVO CON INTEGRACIÓN DE PORTAL INFORMATIVO Y CHATBOT INTERACTIVO CON INTELIGENCIA ARTIFICIAL ORIENTADO A LA OPTIMIZACIÓN DE LA GESTIÓN DE DATOS DE LA ASOCIACIÓN CIVIL DE TRABAJADORES DE TELECOMUNICACIONES JUBILADOS Y PENSIONADOS DE CARABOBO (AJUPTEL), REGIÓN CARABOBO</w:t>
       </w:r>
     </w:p>
     <w:p>
@@ -20887,6 +20857,29 @@
     </w:pPr>
     <w:rPr/>
   </w:style>
+  <w:style w:type="paragraph" w:styleId="Contenidodelatabla">
+    <w:name w:val="Contenido de la tabla"/>
+    <w:basedOn w:val="Normal"/>
+    <w:qFormat/>
+    <w:pPr>
+      <w:widowControl w:val="false"/>
+      <w:suppressLineNumbers/>
+    </w:pPr>
+    <w:rPr/>
+  </w:style>
+  <w:style w:type="paragraph" w:styleId="Ttulodelatabla">
+    <w:name w:val="Título de la tabla"/>
+    <w:basedOn w:val="Contenidodelatabla"/>
+    <w:qFormat/>
+    <w:pPr>
+      <w:suppressLineNumbers/>
+      <w:jc w:val="center"/>
+    </w:pPr>
+    <w:rPr>
+      <w:b/>
+      <w:bCs/>
+    </w:rPr>
+  </w:style>
   <w:style w:type="numbering" w:styleId="Ningunalista" w:default="1">
     <w:name w:val="Ninguna lista"/>
     <w:uiPriority w:val="99"/>

</xml_diff>